<commit_message>
docs: inserta evidencias (issue, commits, pruebas, release) en el informe del caso B
</commit_message>
<xml_diff>
--- a/docs/Tarea4_Control_de_Configuracion_CR-004_Matriculas.docx
+++ b/docs/Tarea4_Control_de_Configuracion_CR-004_Matriculas.docx
@@ -267,7 +267,7 @@
     </w:p>
     <w:p>
       <w:pPr>
-        <w:spacing w:after="160"/>
+        <w:spacing w:after="180"/>
         <w:jc w:val="center"/>
       </w:pPr>
       <w:r>
@@ -361,7 +361,7 @@
     </w:p>
     <w:p>
       <w:pPr>
-        <w:spacing w:after="160"/>
+        <w:spacing w:after="180"/>
         <w:jc w:val="center"/>
       </w:pPr>
       <w:r>
@@ -840,7 +840,7 @@
     </w:p>
     <w:p>
       <w:pPr>
-        <w:spacing w:after="160"/>
+        <w:spacing w:after="180"/>
         <w:jc w:val="center"/>
       </w:pPr>
       <w:r>
@@ -1045,7 +1045,7 @@
           <w:sz w:val="22"/>
           <w:szCs w:val="22"/>
         </w:rPr>
-        <w:t xml:space="preserve">A continuación pego las capturas de la gestión del cambio en GitHub.</w:t>
+        <w:t xml:space="preserve">A continuación se muestran las capturas de la gestión del cambio en GitHub.</w:t>
       </w:r>
     </w:p>
     <w:p>
@@ -1063,121 +1063,67 @@
         <w:t xml:space="preserve">9.1. Issue del incidente (CR)</w:t>
       </w:r>
     </w:p>
-    <w:tbl>
-      <w:tblPr>
-        <w:tblW w:type="dxa" w:w="9360"/>
-        <w:tblBorders>
-          <w:top w:val="single" w:color="auto" w:sz="4"/>
-          <w:left w:val="single" w:color="auto" w:sz="4"/>
-          <w:bottom w:val="single" w:color="auto" w:sz="4"/>
-          <w:right w:val="single" w:color="auto" w:sz="4"/>
-          <w:insideH w:val="single" w:color="auto" w:sz="4"/>
-          <w:insideV w:val="single" w:color="auto" w:sz="4"/>
-        </w:tblBorders>
-      </w:tblPr>
-      <w:tblGrid>
-        <w:gridCol w:w="9360"/>
-      </w:tblGrid>
-      <w:tr>
-        <w:tc>
-          <w:tcPr>
-            <w:tcW w:type="dxa" w:w="9360"/>
-            <w:tcBorders>
-              <w:top w:val="dashed" w:color="9AA5B1" w:sz="6"/>
-              <w:left w:val="dashed" w:color="9AA5B1" w:sz="6"/>
-              <w:bottom w:val="dashed" w:color="9AA5B1" w:sz="6"/>
-              <w:right w:val="dashed" w:color="9AA5B1" w:sz="6"/>
-            </w:tcBorders>
-            <w:shd w:fill="F4F6F8" w:val="clear"/>
-            <w:tcMar>
-              <w:top w:type="dxa" w:w="100"/>
-              <w:left w:type="dxa" w:w="140"/>
-              <w:bottom w:type="dxa" w:w="100"/>
-              <w:right w:type="dxa" w:w="140"/>
-            </w:tcMar>
-          </w:tcPr>
-          <w:p>
-            <w:pPr>
-              <w:spacing w:after="40"/>
-              <w:jc w:val="center"/>
-            </w:pPr>
-            <w:r>
-              <w:rPr>
-                <w:rFonts w:ascii="Calibri" w:cs="Calibri" w:eastAsia="Calibri" w:hAnsi="Calibri"/>
-                <w:i/>
-                <w:iCs/>
-                <w:color w:val="808080"/>
-                <w:sz w:val="20"/>
-                <w:szCs w:val="20"/>
-              </w:rPr>
-              <w:t xml:space="preserve">[ Captura del Issue del incidente ]</w:t>
-            </w:r>
-          </w:p>
-          <w:p>
-            <w:r>
-              <w:rPr>
-                <w:rFonts w:ascii="Calibri" w:cs="Calibri" w:eastAsia="Calibri" w:hAnsi="Calibri"/>
-              </w:rPr>
-              <w:t xml:space="preserve"> </w:t>
-            </w:r>
-          </w:p>
-          <w:p>
-            <w:r>
-              <w:rPr>
-                <w:rFonts w:ascii="Calibri" w:cs="Calibri" w:eastAsia="Calibri" w:hAnsi="Calibri"/>
-              </w:rPr>
-              <w:t xml:space="preserve"> </w:t>
-            </w:r>
-          </w:p>
-          <w:p>
-            <w:r>
-              <w:rPr>
-                <w:rFonts w:ascii="Calibri" w:cs="Calibri" w:eastAsia="Calibri" w:hAnsi="Calibri"/>
-              </w:rPr>
-              <w:t xml:space="preserve"> </w:t>
-            </w:r>
-          </w:p>
-          <w:p>
-            <w:r>
-              <w:rPr>
-                <w:rFonts w:ascii="Calibri" w:cs="Calibri" w:eastAsia="Calibri" w:hAnsi="Calibri"/>
-              </w:rPr>
-              <w:t xml:space="preserve"> </w:t>
-            </w:r>
-          </w:p>
-          <w:p>
-            <w:r>
-              <w:rPr>
-                <w:rFonts w:ascii="Calibri" w:cs="Calibri" w:eastAsia="Calibri" w:hAnsi="Calibri"/>
-              </w:rPr>
-              <w:t xml:space="preserve"> </w:t>
-            </w:r>
-          </w:p>
-          <w:p>
-            <w:r>
-              <w:rPr>
-                <w:rFonts w:ascii="Calibri" w:cs="Calibri" w:eastAsia="Calibri" w:hAnsi="Calibri"/>
-              </w:rPr>
-              <w:t xml:space="preserve"> </w:t>
-            </w:r>
-          </w:p>
-          <w:p>
-            <w:r>
-              <w:rPr>
-                <w:rFonts w:ascii="Calibri" w:cs="Calibri" w:eastAsia="Calibri" w:hAnsi="Calibri"/>
-              </w:rPr>
-              <w:t xml:space="preserve"> </w:t>
-            </w:r>
-          </w:p>
-        </w:tc>
-      </w:tr>
-    </w:tbl>
-    <w:p>
-      <w:pPr>
-        <w:spacing w:after="100"/>
-      </w:pPr>
-      <w:r>
-        <w:t xml:space="preserve"> </w:t>
+    <w:p>
+      <w:pPr>
+        <w:spacing w:after="40" w:before="80"/>
+        <w:jc w:val="center"/>
+      </w:pPr>
+      <w:r>
+        <w:drawing>
+          <wp:inline distT="0" distB="0" distL="0" distR="0">
+            <wp:extent cx="5334000" cy="3857625"/>
+            <wp:effectExtent t="0" r="0" b="0" l="0"/>
+            <wp:docPr id="1" name="" descr="" title=""/>
+            <wp:cNvGraphicFramePr>
+              <a:graphicFrameLocks xmlns:a="http://schemas.openxmlformats.org/drawingml/2006/main" noChangeAspect="1"/>
+            </wp:cNvGraphicFramePr>
+            <a:graphic xmlns:a="http://schemas.openxmlformats.org/drawingml/2006/main">
+              <a:graphicData uri="http://schemas.openxmlformats.org/drawingml/2006/picture">
+                <pic:pic xmlns:pic="http://schemas.openxmlformats.org/drawingml/2006/picture">
+                  <pic:nvPicPr>
+                    <pic:cNvPr id="0" name="" descr=""/>
+                    <pic:cNvPicPr>
+                      <a:picLocks noChangeAspect="1" noChangeArrowheads="1"/>
+                    </pic:cNvPicPr>
+                  </pic:nvPicPr>
+                  <pic:blipFill>
+                    <a:blip r:embed="rId10" cstate="none"/>
+                    <a:srcRect/>
+                    <a:stretch>
+                      <a:fillRect/>
+                    </a:stretch>
+                  </pic:blipFill>
+                  <pic:spPr bwMode="auto">
+                    <a:xfrm>
+                      <a:off x="0" y="0"/>
+                      <a:ext cx="5334000" cy="3857625"/>
+                    </a:xfrm>
+                    <a:prstGeom prst="rect">
+                      <a:avLst/>
+                    </a:prstGeom>
+                  </pic:spPr>
+                </pic:pic>
+              </a:graphicData>
+            </a:graphic>
+          </wp:inline>
+        </w:drawing>
+      </w:r>
+    </w:p>
+    <w:p>
+      <w:pPr>
+        <w:spacing w:after="180"/>
+        <w:jc w:val="center"/>
+      </w:pPr>
+      <w:r>
+        <w:rPr>
+          <w:rFonts w:ascii="Calibri" w:cs="Calibri" w:eastAsia="Calibri" w:hAnsi="Calibri"/>
+          <w:i/>
+          <w:iCs/>
+          <w:color w:val="808080"/>
+          <w:sz w:val="18"/>
+          <w:szCs w:val="18"/>
+        </w:rPr>
+        <w:t xml:space="preserve">Figura 4. Issue #12 con la solicitud de cambio, decisión y checklist de seguimiento.</w:t>
       </w:r>
     </w:p>
     <w:p>
@@ -1195,121 +1141,67 @@
         <w:t xml:space="preserve">9.2. Commits del hotfix</w:t>
       </w:r>
     </w:p>
-    <w:tbl>
-      <w:tblPr>
-        <w:tblW w:type="dxa" w:w="9360"/>
-        <w:tblBorders>
-          <w:top w:val="single" w:color="auto" w:sz="4"/>
-          <w:left w:val="single" w:color="auto" w:sz="4"/>
-          <w:bottom w:val="single" w:color="auto" w:sz="4"/>
-          <w:right w:val="single" w:color="auto" w:sz="4"/>
-          <w:insideH w:val="single" w:color="auto" w:sz="4"/>
-          <w:insideV w:val="single" w:color="auto" w:sz="4"/>
-        </w:tblBorders>
-      </w:tblPr>
-      <w:tblGrid>
-        <w:gridCol w:w="9360"/>
-      </w:tblGrid>
-      <w:tr>
-        <w:tc>
-          <w:tcPr>
-            <w:tcW w:type="dxa" w:w="9360"/>
-            <w:tcBorders>
-              <w:top w:val="dashed" w:color="9AA5B1" w:sz="6"/>
-              <w:left w:val="dashed" w:color="9AA5B1" w:sz="6"/>
-              <w:bottom w:val="dashed" w:color="9AA5B1" w:sz="6"/>
-              <w:right w:val="dashed" w:color="9AA5B1" w:sz="6"/>
-            </w:tcBorders>
-            <w:shd w:fill="F4F6F8" w:val="clear"/>
-            <w:tcMar>
-              <w:top w:type="dxa" w:w="100"/>
-              <w:left w:type="dxa" w:w="140"/>
-              <w:bottom w:type="dxa" w:w="100"/>
-              <w:right w:type="dxa" w:w="140"/>
-            </w:tcMar>
-          </w:tcPr>
-          <w:p>
-            <w:pPr>
-              <w:spacing w:after="40"/>
-              <w:jc w:val="center"/>
-            </w:pPr>
-            <w:r>
-              <w:rPr>
-                <w:rFonts w:ascii="Calibri" w:cs="Calibri" w:eastAsia="Calibri" w:hAnsi="Calibri"/>
-                <w:i/>
-                <w:iCs/>
-                <w:color w:val="808080"/>
-                <w:sz w:val="20"/>
-                <w:szCs w:val="20"/>
-              </w:rPr>
-              <w:t xml:space="preserve">[ Captura de los commits / la rama de hotfix ]</w:t>
-            </w:r>
-          </w:p>
-          <w:p>
-            <w:r>
-              <w:rPr>
-                <w:rFonts w:ascii="Calibri" w:cs="Calibri" w:eastAsia="Calibri" w:hAnsi="Calibri"/>
-              </w:rPr>
-              <w:t xml:space="preserve"> </w:t>
-            </w:r>
-          </w:p>
-          <w:p>
-            <w:r>
-              <w:rPr>
-                <w:rFonts w:ascii="Calibri" w:cs="Calibri" w:eastAsia="Calibri" w:hAnsi="Calibri"/>
-              </w:rPr>
-              <w:t xml:space="preserve"> </w:t>
-            </w:r>
-          </w:p>
-          <w:p>
-            <w:r>
-              <w:rPr>
-                <w:rFonts w:ascii="Calibri" w:cs="Calibri" w:eastAsia="Calibri" w:hAnsi="Calibri"/>
-              </w:rPr>
-              <w:t xml:space="preserve"> </w:t>
-            </w:r>
-          </w:p>
-          <w:p>
-            <w:r>
-              <w:rPr>
-                <w:rFonts w:ascii="Calibri" w:cs="Calibri" w:eastAsia="Calibri" w:hAnsi="Calibri"/>
-              </w:rPr>
-              <w:t xml:space="preserve"> </w:t>
-            </w:r>
-          </w:p>
-          <w:p>
-            <w:r>
-              <w:rPr>
-                <w:rFonts w:ascii="Calibri" w:cs="Calibri" w:eastAsia="Calibri" w:hAnsi="Calibri"/>
-              </w:rPr>
-              <w:t xml:space="preserve"> </w:t>
-            </w:r>
-          </w:p>
-          <w:p>
-            <w:r>
-              <w:rPr>
-                <w:rFonts w:ascii="Calibri" w:cs="Calibri" w:eastAsia="Calibri" w:hAnsi="Calibri"/>
-              </w:rPr>
-              <w:t xml:space="preserve"> </w:t>
-            </w:r>
-          </w:p>
-          <w:p>
-            <w:r>
-              <w:rPr>
-                <w:rFonts w:ascii="Calibri" w:cs="Calibri" w:eastAsia="Calibri" w:hAnsi="Calibri"/>
-              </w:rPr>
-              <w:t xml:space="preserve"> </w:t>
-            </w:r>
-          </w:p>
-        </w:tc>
-      </w:tr>
-    </w:tbl>
-    <w:p>
-      <w:pPr>
-        <w:spacing w:after="100"/>
-      </w:pPr>
-      <w:r>
-        <w:t xml:space="preserve"> </w:t>
+    <w:p>
+      <w:pPr>
+        <w:spacing w:after="40" w:before="80"/>
+        <w:jc w:val="center"/>
+      </w:pPr>
+      <w:r>
+        <w:drawing>
+          <wp:inline distT="0" distB="0" distL="0" distR="0">
+            <wp:extent cx="5334000" cy="3476625"/>
+            <wp:effectExtent t="0" r="0" b="0" l="0"/>
+            <wp:docPr id="1" name="" descr="" title=""/>
+            <wp:cNvGraphicFramePr>
+              <a:graphicFrameLocks xmlns:a="http://schemas.openxmlformats.org/drawingml/2006/main" noChangeAspect="1"/>
+            </wp:cNvGraphicFramePr>
+            <a:graphic xmlns:a="http://schemas.openxmlformats.org/drawingml/2006/main">
+              <a:graphicData uri="http://schemas.openxmlformats.org/drawingml/2006/picture">
+                <pic:pic xmlns:pic="http://schemas.openxmlformats.org/drawingml/2006/picture">
+                  <pic:nvPicPr>
+                    <pic:cNvPr id="0" name="" descr=""/>
+                    <pic:cNvPicPr>
+                      <a:picLocks noChangeAspect="1" noChangeArrowheads="1"/>
+                    </pic:cNvPicPr>
+                  </pic:nvPicPr>
+                  <pic:blipFill>
+                    <a:blip r:embed="rId11" cstate="none"/>
+                    <a:srcRect/>
+                    <a:stretch>
+                      <a:fillRect/>
+                    </a:stretch>
+                  </pic:blipFill>
+                  <pic:spPr bwMode="auto">
+                    <a:xfrm>
+                      <a:off x="0" y="0"/>
+                      <a:ext cx="5334000" cy="3476625"/>
+                    </a:xfrm>
+                    <a:prstGeom prst="rect">
+                      <a:avLst/>
+                    </a:prstGeom>
+                  </pic:spPr>
+                </pic:pic>
+              </a:graphicData>
+            </a:graphic>
+          </wp:inline>
+        </w:drawing>
+      </w:r>
+    </w:p>
+    <w:p>
+      <w:pPr>
+        <w:spacing w:after="180"/>
+        <w:jc w:val="center"/>
+      </w:pPr>
+      <w:r>
+        <w:rPr>
+          <w:rFonts w:ascii="Calibri" w:cs="Calibri" w:eastAsia="Calibri" w:hAnsi="Calibri"/>
+          <w:i/>
+          <w:iCs/>
+          <w:color w:val="808080"/>
+          <w:sz w:val="18"/>
+          <w:szCs w:val="18"/>
+        </w:rPr>
+        <w:t xml:space="preserve">Figura 5. Commits de la rama hotfix/CR-004-pagos-duplicados.</w:t>
       </w:r>
     </w:p>
     <w:p>
@@ -1327,121 +1219,67 @@
         <w:t xml:space="preserve">9.3. Pruebas</w:t>
       </w:r>
     </w:p>
-    <w:tbl>
-      <w:tblPr>
-        <w:tblW w:type="dxa" w:w="9360"/>
-        <w:tblBorders>
-          <w:top w:val="single" w:color="auto" w:sz="4"/>
-          <w:left w:val="single" w:color="auto" w:sz="4"/>
-          <w:bottom w:val="single" w:color="auto" w:sz="4"/>
-          <w:right w:val="single" w:color="auto" w:sz="4"/>
-          <w:insideH w:val="single" w:color="auto" w:sz="4"/>
-          <w:insideV w:val="single" w:color="auto" w:sz="4"/>
-        </w:tblBorders>
-      </w:tblPr>
-      <w:tblGrid>
-        <w:gridCol w:w="9360"/>
-      </w:tblGrid>
-      <w:tr>
-        <w:tc>
-          <w:tcPr>
-            <w:tcW w:type="dxa" w:w="9360"/>
-            <w:tcBorders>
-              <w:top w:val="dashed" w:color="9AA5B1" w:sz="6"/>
-              <w:left w:val="dashed" w:color="9AA5B1" w:sz="6"/>
-              <w:bottom w:val="dashed" w:color="9AA5B1" w:sz="6"/>
-              <w:right w:val="dashed" w:color="9AA5B1" w:sz="6"/>
-            </w:tcBorders>
-            <w:shd w:fill="F4F6F8" w:val="clear"/>
-            <w:tcMar>
-              <w:top w:type="dxa" w:w="100"/>
-              <w:left w:type="dxa" w:w="140"/>
-              <w:bottom w:type="dxa" w:w="100"/>
-              <w:right w:type="dxa" w:w="140"/>
-            </w:tcMar>
-          </w:tcPr>
-          <w:p>
-            <w:pPr>
-              <w:spacing w:after="40"/>
-              <w:jc w:val="center"/>
-            </w:pPr>
-            <w:r>
-              <w:rPr>
-                <w:rFonts w:ascii="Calibri" w:cs="Calibri" w:eastAsia="Calibri" w:hAnsi="Calibri"/>
-                <w:i/>
-                <w:iCs/>
-                <w:color w:val="808080"/>
-                <w:sz w:val="20"/>
-                <w:szCs w:val="20"/>
-              </w:rPr>
-              <w:t xml:space="preserve">[ Captura del resultado de las pruebas ]</w:t>
-            </w:r>
-          </w:p>
-          <w:p>
-            <w:r>
-              <w:rPr>
-                <w:rFonts w:ascii="Calibri" w:cs="Calibri" w:eastAsia="Calibri" w:hAnsi="Calibri"/>
-              </w:rPr>
-              <w:t xml:space="preserve"> </w:t>
-            </w:r>
-          </w:p>
-          <w:p>
-            <w:r>
-              <w:rPr>
-                <w:rFonts w:ascii="Calibri" w:cs="Calibri" w:eastAsia="Calibri" w:hAnsi="Calibri"/>
-              </w:rPr>
-              <w:t xml:space="preserve"> </w:t>
-            </w:r>
-          </w:p>
-          <w:p>
-            <w:r>
-              <w:rPr>
-                <w:rFonts w:ascii="Calibri" w:cs="Calibri" w:eastAsia="Calibri" w:hAnsi="Calibri"/>
-              </w:rPr>
-              <w:t xml:space="preserve"> </w:t>
-            </w:r>
-          </w:p>
-          <w:p>
-            <w:r>
-              <w:rPr>
-                <w:rFonts w:ascii="Calibri" w:cs="Calibri" w:eastAsia="Calibri" w:hAnsi="Calibri"/>
-              </w:rPr>
-              <w:t xml:space="preserve"> </w:t>
-            </w:r>
-          </w:p>
-          <w:p>
-            <w:r>
-              <w:rPr>
-                <w:rFonts w:ascii="Calibri" w:cs="Calibri" w:eastAsia="Calibri" w:hAnsi="Calibri"/>
-              </w:rPr>
-              <w:t xml:space="preserve"> </w:t>
-            </w:r>
-          </w:p>
-          <w:p>
-            <w:r>
-              <w:rPr>
-                <w:rFonts w:ascii="Calibri" w:cs="Calibri" w:eastAsia="Calibri" w:hAnsi="Calibri"/>
-              </w:rPr>
-              <w:t xml:space="preserve"> </w:t>
-            </w:r>
-          </w:p>
-          <w:p>
-            <w:r>
-              <w:rPr>
-                <w:rFonts w:ascii="Calibri" w:cs="Calibri" w:eastAsia="Calibri" w:hAnsi="Calibri"/>
-              </w:rPr>
-              <w:t xml:space="preserve"> </w:t>
-            </w:r>
-          </w:p>
-        </w:tc>
-      </w:tr>
-    </w:tbl>
-    <w:p>
-      <w:pPr>
-        <w:spacing w:after="100"/>
-      </w:pPr>
-      <w:r>
-        <w:t xml:space="preserve"> </w:t>
+    <w:p>
+      <w:pPr>
+        <w:spacing w:after="40" w:before="80"/>
+        <w:jc w:val="center"/>
+      </w:pPr>
+      <w:r>
+        <w:drawing>
+          <wp:inline distT="0" distB="0" distL="0" distR="0">
+            <wp:extent cx="5334000" cy="2724150"/>
+            <wp:effectExtent t="0" r="0" b="0" l="0"/>
+            <wp:docPr id="1" name="" descr="" title=""/>
+            <wp:cNvGraphicFramePr>
+              <a:graphicFrameLocks xmlns:a="http://schemas.openxmlformats.org/drawingml/2006/main" noChangeAspect="1"/>
+            </wp:cNvGraphicFramePr>
+            <a:graphic xmlns:a="http://schemas.openxmlformats.org/drawingml/2006/main">
+              <a:graphicData uri="http://schemas.openxmlformats.org/drawingml/2006/picture">
+                <pic:pic xmlns:pic="http://schemas.openxmlformats.org/drawingml/2006/picture">
+                  <pic:nvPicPr>
+                    <pic:cNvPr id="0" name="" descr=""/>
+                    <pic:cNvPicPr>
+                      <a:picLocks noChangeAspect="1" noChangeArrowheads="1"/>
+                    </pic:cNvPicPr>
+                  </pic:nvPicPr>
+                  <pic:blipFill>
+                    <a:blip r:embed="rId12" cstate="none"/>
+                    <a:srcRect/>
+                    <a:stretch>
+                      <a:fillRect/>
+                    </a:stretch>
+                  </pic:blipFill>
+                  <pic:spPr bwMode="auto">
+                    <a:xfrm>
+                      <a:off x="0" y="0"/>
+                      <a:ext cx="5334000" cy="2724150"/>
+                    </a:xfrm>
+                    <a:prstGeom prst="rect">
+                      <a:avLst/>
+                    </a:prstGeom>
+                  </pic:spPr>
+                </pic:pic>
+              </a:graphicData>
+            </a:graphic>
+          </wp:inline>
+        </w:drawing>
+      </w:r>
+    </w:p>
+    <w:p>
+      <w:pPr>
+        <w:spacing w:after="180"/>
+        <w:jc w:val="center"/>
+      </w:pPr>
+      <w:r>
+        <w:rPr>
+          <w:rFonts w:ascii="Calibri" w:cs="Calibri" w:eastAsia="Calibri" w:hAnsi="Calibri"/>
+          <w:i/>
+          <w:iCs/>
+          <w:color w:val="808080"/>
+          <w:sz w:val="18"/>
+          <w:szCs w:val="18"/>
+        </w:rPr>
+        <w:t xml:space="preserve">Figura 6. Pruebas de concurrencia y carga: el cobro ya no se duplica (6 passed).</w:t>
       </w:r>
     </w:p>
     <w:p>
@@ -1459,121 +1297,67 @@
         <w:t xml:space="preserve">9.4. Versión publicada</w:t>
       </w:r>
     </w:p>
-    <w:tbl>
-      <w:tblPr>
-        <w:tblW w:type="dxa" w:w="9360"/>
-        <w:tblBorders>
-          <w:top w:val="single" w:color="auto" w:sz="4"/>
-          <w:left w:val="single" w:color="auto" w:sz="4"/>
-          <w:bottom w:val="single" w:color="auto" w:sz="4"/>
-          <w:right w:val="single" w:color="auto" w:sz="4"/>
-          <w:insideH w:val="single" w:color="auto" w:sz="4"/>
-          <w:insideV w:val="single" w:color="auto" w:sz="4"/>
-        </w:tblBorders>
-      </w:tblPr>
-      <w:tblGrid>
-        <w:gridCol w:w="9360"/>
-      </w:tblGrid>
-      <w:tr>
-        <w:tc>
-          <w:tcPr>
-            <w:tcW w:type="dxa" w:w="9360"/>
-            <w:tcBorders>
-              <w:top w:val="dashed" w:color="9AA5B1" w:sz="6"/>
-              <w:left w:val="dashed" w:color="9AA5B1" w:sz="6"/>
-              <w:bottom w:val="dashed" w:color="9AA5B1" w:sz="6"/>
-              <w:right w:val="dashed" w:color="9AA5B1" w:sz="6"/>
-            </w:tcBorders>
-            <w:shd w:fill="F4F6F8" w:val="clear"/>
-            <w:tcMar>
-              <w:top w:type="dxa" w:w="100"/>
-              <w:left w:type="dxa" w:w="140"/>
-              <w:bottom w:type="dxa" w:w="100"/>
-              <w:right w:type="dxa" w:w="140"/>
-            </w:tcMar>
-          </w:tcPr>
-          <w:p>
-            <w:pPr>
-              <w:spacing w:after="40"/>
-              <w:jc w:val="center"/>
-            </w:pPr>
-            <w:r>
-              <w:rPr>
-                <w:rFonts w:ascii="Calibri" w:cs="Calibri" w:eastAsia="Calibri" w:hAnsi="Calibri"/>
-                <w:i/>
-                <w:iCs/>
-                <w:color w:val="808080"/>
-                <w:sz w:val="20"/>
-                <w:szCs w:val="20"/>
-              </w:rPr>
-              <w:t xml:space="preserve">[ Captura del Release v2.3.1 ]</w:t>
-            </w:r>
-          </w:p>
-          <w:p>
-            <w:r>
-              <w:rPr>
-                <w:rFonts w:ascii="Calibri" w:cs="Calibri" w:eastAsia="Calibri" w:hAnsi="Calibri"/>
-              </w:rPr>
-              <w:t xml:space="preserve"> </w:t>
-            </w:r>
-          </w:p>
-          <w:p>
-            <w:r>
-              <w:rPr>
-                <w:rFonts w:ascii="Calibri" w:cs="Calibri" w:eastAsia="Calibri" w:hAnsi="Calibri"/>
-              </w:rPr>
-              <w:t xml:space="preserve"> </w:t>
-            </w:r>
-          </w:p>
-          <w:p>
-            <w:r>
-              <w:rPr>
-                <w:rFonts w:ascii="Calibri" w:cs="Calibri" w:eastAsia="Calibri" w:hAnsi="Calibri"/>
-              </w:rPr>
-              <w:t xml:space="preserve"> </w:t>
-            </w:r>
-          </w:p>
-          <w:p>
-            <w:r>
-              <w:rPr>
-                <w:rFonts w:ascii="Calibri" w:cs="Calibri" w:eastAsia="Calibri" w:hAnsi="Calibri"/>
-              </w:rPr>
-              <w:t xml:space="preserve"> </w:t>
-            </w:r>
-          </w:p>
-          <w:p>
-            <w:r>
-              <w:rPr>
-                <w:rFonts w:ascii="Calibri" w:cs="Calibri" w:eastAsia="Calibri" w:hAnsi="Calibri"/>
-              </w:rPr>
-              <w:t xml:space="preserve"> </w:t>
-            </w:r>
-          </w:p>
-          <w:p>
-            <w:r>
-              <w:rPr>
-                <w:rFonts w:ascii="Calibri" w:cs="Calibri" w:eastAsia="Calibri" w:hAnsi="Calibri"/>
-              </w:rPr>
-              <w:t xml:space="preserve"> </w:t>
-            </w:r>
-          </w:p>
-          <w:p>
-            <w:r>
-              <w:rPr>
-                <w:rFonts w:ascii="Calibri" w:cs="Calibri" w:eastAsia="Calibri" w:hAnsi="Calibri"/>
-              </w:rPr>
-              <w:t xml:space="preserve"> </w:t>
-            </w:r>
-          </w:p>
-        </w:tc>
-      </w:tr>
-    </w:tbl>
-    <w:p>
-      <w:pPr>
-        <w:spacing w:after="100"/>
-      </w:pPr>
-      <w:r>
-        <w:t xml:space="preserve"> </w:t>
+    <w:p>
+      <w:pPr>
+        <w:spacing w:after="40" w:before="80"/>
+        <w:jc w:val="center"/>
+      </w:pPr>
+      <w:r>
+        <w:drawing>
+          <wp:inline distT="0" distB="0" distL="0" distR="0">
+            <wp:extent cx="5334000" cy="3790950"/>
+            <wp:effectExtent t="0" r="0" b="0" l="0"/>
+            <wp:docPr id="1" name="" descr="" title=""/>
+            <wp:cNvGraphicFramePr>
+              <a:graphicFrameLocks xmlns:a="http://schemas.openxmlformats.org/drawingml/2006/main" noChangeAspect="1"/>
+            </wp:cNvGraphicFramePr>
+            <a:graphic xmlns:a="http://schemas.openxmlformats.org/drawingml/2006/main">
+              <a:graphicData uri="http://schemas.openxmlformats.org/drawingml/2006/picture">
+                <pic:pic xmlns:pic="http://schemas.openxmlformats.org/drawingml/2006/picture">
+                  <pic:nvPicPr>
+                    <pic:cNvPr id="0" name="" descr=""/>
+                    <pic:cNvPicPr>
+                      <a:picLocks noChangeAspect="1" noChangeArrowheads="1"/>
+                    </pic:cNvPicPr>
+                  </pic:nvPicPr>
+                  <pic:blipFill>
+                    <a:blip r:embed="rId13" cstate="none"/>
+                    <a:srcRect/>
+                    <a:stretch>
+                      <a:fillRect/>
+                    </a:stretch>
+                  </pic:blipFill>
+                  <pic:spPr bwMode="auto">
+                    <a:xfrm>
+                      <a:off x="0" y="0"/>
+                      <a:ext cx="5334000" cy="3790950"/>
+                    </a:xfrm>
+                    <a:prstGeom prst="rect">
+                      <a:avLst/>
+                    </a:prstGeom>
+                  </pic:spPr>
+                </pic:pic>
+              </a:graphicData>
+            </a:graphic>
+          </wp:inline>
+        </w:drawing>
+      </w:r>
+    </w:p>
+    <w:p>
+      <w:pPr>
+        <w:spacing w:after="180"/>
+        <w:jc w:val="center"/>
+      </w:pPr>
+      <w:r>
+        <w:rPr>
+          <w:rFonts w:ascii="Calibri" w:cs="Calibri" w:eastAsia="Calibri" w:hAnsi="Calibri"/>
+          <w:i/>
+          <w:iCs/>
+          <w:color w:val="808080"/>
+          <w:sz w:val="18"/>
+          <w:szCs w:val="18"/>
+        </w:rPr>
+        <w:t xml:space="preserve">Figura 7. Release v2.3.1 publicado como versión más reciente (Latest).</w:t>
       </w:r>
     </w:p>
     <w:p>

</xml_diff>